<commit_message>
Automate first-time MoboTerra software setup
Add a one-command software-only installer for Ubuntu 24.04 ARM64 that installs
host prerequisites and builds ROS runtime, GUI and offline CAD images. Validate
configuration, tests, virtual feedback, container health and headless rendering
before publishing the installed release. Keep real adapter identification in
the hardware installer.

Fix ROS package dependencies, test discovery, environment sourcing, supervisor
startup, diagnostic byte serialization and healthcheck discovery. Install GUI
and CAD launchers and update the README files and Word manual.

Validation: 264 ROS tests, 20 deployment tests, virtual startup and healthcheck,
GUI executable checks, CAD imports, headless rendering and the installed CAD
launcher passed on Ubuntu 24.04 ARM64. Physical hardware remains untested.
</commit_message>
<xml_diff>
--- a/MoboTerra_user_manual.docx
+++ b/MoboTerra_user_manual.docx
@@ -24,6 +24,36 @@
       <w:proofErr w:type="spellEnd"/>
       <w:r>
         <w:t>— ROS 2 Jazzy</w:t>
+      </w:r>
+    </w:p>
+    <w:p>
+      <w:r>
+        <w:t xml:space="preserve">Automated first-time software installation</w:t>
+      </w:r>
+    </w:p>
+    <w:p>
+      <w:r>
+        <w:t xml:space="preserve">On Ubuntu 24.04 ARM64, open a terminal in the downloaded MoboTerra project directory and run: bash ./install.sh</w:t>
+      </w:r>
+    </w:p>
+    <w:p>
+      <w:r>
+        <w:t xml:space="preserve">Enter your Ubuntu administrator password when prompted. With no arguments, the installer prepares software only: it installs missing host prerequisites and Docker/Compose, builds the runtime, GUI and offline CAD images, runs ROS tests, validates configuration, and checks virtual joint feedback, wheel status, odometry, diagnostics and container health. It does not configure or start the robot hardware service.</w:t>
+      </w:r>
+    </w:p>
+    <w:p>
+      <w:r>
+        <w:t xml:space="preserve">ROS dependencies and CAD packages are installed inside Docker automatically. No manual host ROS or pip installation is needed. Launch moboterra-gui rviz2 or moboterra-gui rqt_graph from a desktop terminal, or use the MoboTerra desktop menu entries. Run moboterra-tools to write a software-rendered URDF preview in the current directory.</w:t>
+      </w:r>
+    </w:p>
+    <w:p>
+      <w:r>
+        <w:t xml:space="preserve">When both USB-to-CAN adapters are available, run sudo bash ./deploy/install.sh --no-start to identify the platform and battery serials and install the hardware service without starting it. The full sudo bash ./deploy/install.sh command also starts the service after guided adapter identification. --no-start requires real serials; use --software-only when adapters are unavailable.</w:t>
+      </w:r>
+    </w:p>
+    <w:p>
+      <w:r>
+        <w:t xml:space="preserve">Scanner Ethernet addresses, hardware safety wiring and secured commissioning checks still depend on the connected platform. See deploy/README.md for the complete current installer workflow, direct Docker targets, configuration, retries and hardware acceptance checks.</w:t>
       </w:r>
     </w:p>
     <w:p>

</xml_diff>